<commit_message>
docs: v1.3 - scalable SRS for small, medium, and large businesses with feature grouping
</commit_message>
<xml_diff>
--- a/backend/OneGemmy_Backend_SRS.docx
+++ b/backend/OneGemmy_Backend_SRS.docx
@@ -81,7 +81,7 @@
           <w:color w:val="666666"/>
           <w:sz w:val="24"/>
         </w:rPr>
-        <w:t>Version: 1.2</w:t>
+        <w:t>Version: 1.3</w:t>
       </w:r>
     </w:p>
     <w:p>
@@ -432,6 +432,64 @@
           </w:p>
         </w:tc>
       </w:tr>
+      <w:tr>
+        <w:tc>
+          <w:tcPr>
+            <w:tcW w:type="dxa" w:w="2351"/>
+            <w:shd w:fill="E8F4FD"/>
+          </w:tcPr>
+          <w:p>
+            <w:r>
+              <w:rPr>
+                <w:sz w:val="20"/>
+              </w:rPr>
+              <w:t>1.3</w:t>
+            </w:r>
+          </w:p>
+        </w:tc>
+        <w:tc>
+          <w:tcPr>
+            <w:tcW w:type="dxa" w:w="2351"/>
+            <w:shd w:fill="E8F4FD"/>
+          </w:tcPr>
+          <w:p>
+            <w:r>
+              <w:rPr>
+                <w:sz w:val="20"/>
+              </w:rPr>
+              <w:t>July 2026</w:t>
+            </w:r>
+          </w:p>
+        </w:tc>
+        <w:tc>
+          <w:tcPr>
+            <w:tcW w:type="dxa" w:w="2351"/>
+            <w:shd w:fill="E8F4FD"/>
+          </w:tcPr>
+          <w:p>
+            <w:r>
+              <w:rPr>
+                <w:sz w:val="20"/>
+              </w:rPr>
+              <w:t>Gemmy Connect Ltd</w:t>
+            </w:r>
+          </w:p>
+        </w:tc>
+        <w:tc>
+          <w:tcPr>
+            <w:tcW w:type="dxa" w:w="2351"/>
+            <w:shd w:fill="E8F4FD"/>
+          </w:tcPr>
+          <w:p>
+            <w:r>
+              <w:rPr>
+                <w:sz w:val="20"/>
+              </w:rPr>
+              <w:t>Added scalability for small, medium, and large businesses</w:t>
+            </w:r>
+          </w:p>
+        </w:tc>
+      </w:tr>
     </w:tbl>
     <w:p>
       <w:r>
@@ -462,7 +520,7 @@
     </w:p>
     <w:p>
       <w:r>
-        <w:t>This document defines the software requirements for the OneGemmy backend — the server-side engine that powers the entire business management tool. Developed by Gemmy Connect Ltd, the backend is responsible for all business logic, data storage, authentication, calculations, and integrations. While the frontend is what users see and interact with, the backend is where all the real work happens.</w:t>
+        <w:t>This document defines the software requirements for the OneGemmy backend — the server-side engine that powers the entire business management tool. Developed by Gemmy Connect Ltd, the backend is responsible for all business logic, data storage, authentication, calculations, and integrations. It is designed to scale from small businesses with a handful of users to large enterprises with thousands of concurrent users.</w:t>
       </w:r>
     </w:p>
     <w:p>
@@ -1082,7 +1140,563 @@
         <w:rPr>
           <w:color w:val="002B5C"/>
         </w:rPr>
-        <w:t>2. System Architecture</w:t>
+        <w:t>2. Backend Scalability by Business Size</w:t>
+      </w:r>
+    </w:p>
+    <w:p>
+      <w:r>
+        <w:t>The backend architecture supports businesses of all sizes. Here's how the infrastructure scales based on business needs:</w:t>
+      </w:r>
+    </w:p>
+    <w:tbl>
+      <w:tblPr>
+        <w:tblStyle w:val="TableGrid"/>
+        <w:tblW w:type="auto" w:w="0"/>
+        <w:jc w:val="center"/>
+        <w:tblLook w:firstColumn="1" w:firstRow="1" w:lastColumn="0" w:lastRow="0" w:noHBand="0" w:noVBand="1" w:val="04A0"/>
+      </w:tblPr>
+      <w:tblGrid>
+        <w:gridCol w:w="2351"/>
+        <w:gridCol w:w="2351"/>
+        <w:gridCol w:w="2351"/>
+        <w:gridCol w:w="2351"/>
+      </w:tblGrid>
+      <w:tr>
+        <w:tc>
+          <w:tcPr>
+            <w:tcW w:type="dxa" w:w="2160"/>
+            <w:shd w:fill="0070C0"/>
+          </w:tcPr>
+          <w:p>
+            <w:pPr>
+              <w:jc w:val="center"/>
+            </w:pPr>
+            <w:r>
+              <w:rPr>
+                <w:b/>
+                <w:color w:val="FFFFFF"/>
+                <w:sz w:val="20"/>
+              </w:rPr>
+              <w:t>Aspect</w:t>
+            </w:r>
+          </w:p>
+        </w:tc>
+        <w:tc>
+          <w:tcPr>
+            <w:tcW w:type="dxa" w:w="2160"/>
+            <w:shd w:fill="0070C0"/>
+          </w:tcPr>
+          <w:p>
+            <w:pPr>
+              <w:jc w:val="center"/>
+            </w:pPr>
+            <w:r>
+              <w:rPr>
+                <w:b/>
+                <w:color w:val="FFFFFF"/>
+                <w:sz w:val="20"/>
+              </w:rPr>
+              <w:t>Small (1-10)</w:t>
+            </w:r>
+          </w:p>
+        </w:tc>
+        <w:tc>
+          <w:tcPr>
+            <w:tcW w:type="dxa" w:w="2592"/>
+            <w:shd w:fill="0070C0"/>
+          </w:tcPr>
+          <w:p>
+            <w:pPr>
+              <w:jc w:val="center"/>
+            </w:pPr>
+            <w:r>
+              <w:rPr>
+                <w:b/>
+                <w:color w:val="FFFFFF"/>
+                <w:sz w:val="20"/>
+              </w:rPr>
+              <w:t>Medium (10-500)</w:t>
+            </w:r>
+          </w:p>
+        </w:tc>
+        <w:tc>
+          <w:tcPr>
+            <w:tcW w:type="dxa" w:w="2448"/>
+            <w:shd w:fill="0070C0"/>
+          </w:tcPr>
+          <w:p>
+            <w:pPr>
+              <w:jc w:val="center"/>
+            </w:pPr>
+            <w:r>
+              <w:rPr>
+                <w:b/>
+                <w:color w:val="FFFFFF"/>
+                <w:sz w:val="20"/>
+              </w:rPr>
+              <w:t>Large (500+)</w:t>
+            </w:r>
+          </w:p>
+        </w:tc>
+      </w:tr>
+      <w:tr>
+        <w:tc>
+          <w:tcPr>
+            <w:tcW w:type="dxa" w:w="2160"/>
+          </w:tcPr>
+          <w:p>
+            <w:r>
+              <w:rPr>
+                <w:sz w:val="20"/>
+              </w:rPr>
+              <w:t>Deployment</w:t>
+            </w:r>
+          </w:p>
+        </w:tc>
+        <w:tc>
+          <w:tcPr>
+            <w:tcW w:type="dxa" w:w="2160"/>
+          </w:tcPr>
+          <w:p>
+            <w:r>
+              <w:rPr>
+                <w:sz w:val="20"/>
+              </w:rPr>
+              <w:t>Single server / VPS</w:t>
+            </w:r>
+          </w:p>
+        </w:tc>
+        <w:tc>
+          <w:tcPr>
+            <w:tcW w:type="dxa" w:w="2592"/>
+          </w:tcPr>
+          <w:p>
+            <w:r>
+              <w:rPr>
+                <w:sz w:val="20"/>
+              </w:rPr>
+              <w:t>Load-balanced servers</w:t>
+            </w:r>
+          </w:p>
+        </w:tc>
+        <w:tc>
+          <w:tcPr>
+            <w:tcW w:type="dxa" w:w="2448"/>
+          </w:tcPr>
+          <w:p>
+            <w:r>
+              <w:rPr>
+                <w:sz w:val="20"/>
+              </w:rPr>
+              <w:t>Kubernetes cluster</w:t>
+            </w:r>
+          </w:p>
+        </w:tc>
+      </w:tr>
+      <w:tr>
+        <w:tc>
+          <w:tcPr>
+            <w:tcW w:type="dxa" w:w="2160"/>
+            <w:shd w:fill="E8F4FD"/>
+          </w:tcPr>
+          <w:p>
+            <w:r>
+              <w:rPr>
+                <w:sz w:val="20"/>
+              </w:rPr>
+              <w:t>Database</w:t>
+            </w:r>
+          </w:p>
+        </w:tc>
+        <w:tc>
+          <w:tcPr>
+            <w:tcW w:type="dxa" w:w="2160"/>
+            <w:shd w:fill="E8F4FD"/>
+          </w:tcPr>
+          <w:p>
+            <w:r>
+              <w:rPr>
+                <w:sz w:val="20"/>
+              </w:rPr>
+              <w:t>Single PostgreSQL</w:t>
+            </w:r>
+          </w:p>
+        </w:tc>
+        <w:tc>
+          <w:tcPr>
+            <w:tcW w:type="dxa" w:w="2592"/>
+            <w:shd w:fill="E8F4FD"/>
+          </w:tcPr>
+          <w:p>
+            <w:r>
+              <w:rPr>
+                <w:sz w:val="20"/>
+              </w:rPr>
+              <w:t>Primary + Read Replicas</w:t>
+            </w:r>
+          </w:p>
+        </w:tc>
+        <w:tc>
+          <w:tcPr>
+            <w:tcW w:type="dxa" w:w="2448"/>
+            <w:shd w:fill="E8F4FD"/>
+          </w:tcPr>
+          <w:p>
+            <w:r>
+              <w:rPr>
+                <w:sz w:val="20"/>
+              </w:rPr>
+              <w:t>Sharded / Multi-region</w:t>
+            </w:r>
+          </w:p>
+        </w:tc>
+      </w:tr>
+      <w:tr>
+        <w:tc>
+          <w:tcPr>
+            <w:tcW w:type="dxa" w:w="2160"/>
+          </w:tcPr>
+          <w:p>
+            <w:r>
+              <w:rPr>
+                <w:sz w:val="20"/>
+              </w:rPr>
+              <w:t>Cache</w:t>
+            </w:r>
+          </w:p>
+        </w:tc>
+        <w:tc>
+          <w:tcPr>
+            <w:tcW w:type="dxa" w:w="2160"/>
+          </w:tcPr>
+          <w:p>
+            <w:r>
+              <w:rPr>
+                <w:sz w:val="20"/>
+              </w:rPr>
+              <w:t>Single Redis instance</w:t>
+            </w:r>
+          </w:p>
+        </w:tc>
+        <w:tc>
+          <w:tcPr>
+            <w:tcW w:type="dxa" w:w="2592"/>
+          </w:tcPr>
+          <w:p>
+            <w:r>
+              <w:rPr>
+                <w:sz w:val="20"/>
+              </w:rPr>
+              <w:t>Redis Sentinel</w:t>
+            </w:r>
+          </w:p>
+        </w:tc>
+        <w:tc>
+          <w:tcPr>
+            <w:tcW w:type="dxa" w:w="2448"/>
+          </w:tcPr>
+          <w:p>
+            <w:r>
+              <w:rPr>
+                <w:sz w:val="20"/>
+              </w:rPr>
+              <w:t>Redis Cluster</w:t>
+            </w:r>
+          </w:p>
+        </w:tc>
+      </w:tr>
+      <w:tr>
+        <w:tc>
+          <w:tcPr>
+            <w:tcW w:type="dxa" w:w="2160"/>
+            <w:shd w:fill="E8F4FD"/>
+          </w:tcPr>
+          <w:p>
+            <w:r>
+              <w:rPr>
+                <w:sz w:val="20"/>
+              </w:rPr>
+              <w:t>File Storage</w:t>
+            </w:r>
+          </w:p>
+        </w:tc>
+        <w:tc>
+          <w:tcPr>
+            <w:tcW w:type="dxa" w:w="2160"/>
+            <w:shd w:fill="E8F4FD"/>
+          </w:tcPr>
+          <w:p>
+            <w:r>
+              <w:rPr>
+                <w:sz w:val="20"/>
+              </w:rPr>
+              <w:t>Local / Basic S3</w:t>
+            </w:r>
+          </w:p>
+        </w:tc>
+        <w:tc>
+          <w:tcPr>
+            <w:tcW w:type="dxa" w:w="2592"/>
+            <w:shd w:fill="E8F4FD"/>
+          </w:tcPr>
+          <w:p>
+            <w:r>
+              <w:rPr>
+                <w:sz w:val="20"/>
+              </w:rPr>
+              <w:t>S3 with CDN</w:t>
+            </w:r>
+          </w:p>
+        </w:tc>
+        <w:tc>
+          <w:tcPr>
+            <w:tcW w:type="dxa" w:w="2448"/>
+            <w:shd w:fill="E8F4FD"/>
+          </w:tcPr>
+          <w:p>
+            <w:r>
+              <w:rPr>
+                <w:sz w:val="20"/>
+              </w:rPr>
+              <w:t>Multi-region S3 + CDN</w:t>
+            </w:r>
+          </w:p>
+        </w:tc>
+      </w:tr>
+      <w:tr>
+        <w:tc>
+          <w:tcPr>
+            <w:tcW w:type="dxa" w:w="2160"/>
+          </w:tcPr>
+          <w:p>
+            <w:r>
+              <w:rPr>
+                <w:sz w:val="20"/>
+              </w:rPr>
+              <w:t>Background Jobs</w:t>
+            </w:r>
+          </w:p>
+        </w:tc>
+        <w:tc>
+          <w:tcPr>
+            <w:tcW w:type="dxa" w:w="2160"/>
+          </w:tcPr>
+          <w:p>
+            <w:r>
+              <w:rPr>
+                <w:sz w:val="20"/>
+              </w:rPr>
+              <w:t>Single worker</w:t>
+            </w:r>
+          </w:p>
+        </w:tc>
+        <w:tc>
+          <w:tcPr>
+            <w:tcW w:type="dxa" w:w="2592"/>
+          </w:tcPr>
+          <w:p>
+            <w:r>
+              <w:rPr>
+                <w:sz w:val="20"/>
+              </w:rPr>
+              <w:t>Multiple workers</w:t>
+            </w:r>
+          </w:p>
+        </w:tc>
+        <w:tc>
+          <w:tcPr>
+            <w:tcW w:type="dxa" w:w="2448"/>
+          </w:tcPr>
+          <w:p>
+            <w:r>
+              <w:rPr>
+                <w:sz w:val="20"/>
+              </w:rPr>
+              <w:t>Distributed job queue</w:t>
+            </w:r>
+          </w:p>
+        </w:tc>
+      </w:tr>
+      <w:tr>
+        <w:tc>
+          <w:tcPr>
+            <w:tcW w:type="dxa" w:w="2160"/>
+            <w:shd w:fill="E8F4FD"/>
+          </w:tcPr>
+          <w:p>
+            <w:r>
+              <w:rPr>
+                <w:sz w:val="20"/>
+              </w:rPr>
+              <w:t>Monitoring</w:t>
+            </w:r>
+          </w:p>
+        </w:tc>
+        <w:tc>
+          <w:tcPr>
+            <w:tcW w:type="dxa" w:w="2160"/>
+            <w:shd w:fill="E8F4FD"/>
+          </w:tcPr>
+          <w:p>
+            <w:r>
+              <w:rPr>
+                <w:sz w:val="20"/>
+              </w:rPr>
+              <w:t>Basic logging</w:t>
+            </w:r>
+          </w:p>
+        </w:tc>
+        <w:tc>
+          <w:tcPr>
+            <w:tcW w:type="dxa" w:w="2592"/>
+            <w:shd w:fill="E8F4FD"/>
+          </w:tcPr>
+          <w:p>
+            <w:r>
+              <w:rPr>
+                <w:sz w:val="20"/>
+              </w:rPr>
+              <w:t>Centralized logging (ELK)</w:t>
+            </w:r>
+          </w:p>
+        </w:tc>
+        <w:tc>
+          <w:tcPr>
+            <w:tcW w:type="dxa" w:w="2448"/>
+            <w:shd w:fill="E8F4FD"/>
+          </w:tcPr>
+          <w:p>
+            <w:r>
+              <w:rPr>
+                <w:sz w:val="20"/>
+              </w:rPr>
+              <w:t>Full observability (Datadog)</w:t>
+            </w:r>
+          </w:p>
+        </w:tc>
+      </w:tr>
+      <w:tr>
+        <w:tc>
+          <w:tcPr>
+            <w:tcW w:type="dxa" w:w="2160"/>
+          </w:tcPr>
+          <w:p>
+            <w:r>
+              <w:rPr>
+                <w:sz w:val="20"/>
+              </w:rPr>
+              <w:t>Backup</w:t>
+            </w:r>
+          </w:p>
+        </w:tc>
+        <w:tc>
+          <w:tcPr>
+            <w:tcW w:type="dxa" w:w="2160"/>
+          </w:tcPr>
+          <w:p>
+            <w:r>
+              <w:rPr>
+                <w:sz w:val="20"/>
+              </w:rPr>
+              <w:t>Daily automated</w:t>
+            </w:r>
+          </w:p>
+        </w:tc>
+        <w:tc>
+          <w:tcPr>
+            <w:tcW w:type="dxa" w:w="2592"/>
+          </w:tcPr>
+          <w:p>
+            <w:r>
+              <w:rPr>
+                <w:sz w:val="20"/>
+              </w:rPr>
+              <w:t>Hourly + point-in-time</w:t>
+            </w:r>
+          </w:p>
+        </w:tc>
+        <w:tc>
+          <w:tcPr>
+            <w:tcW w:type="dxa" w:w="2448"/>
+          </w:tcPr>
+          <w:p>
+            <w:r>
+              <w:rPr>
+                <w:sz w:val="20"/>
+              </w:rPr>
+              <w:t>Real-time replication</w:t>
+            </w:r>
+          </w:p>
+        </w:tc>
+      </w:tr>
+      <w:tr>
+        <w:tc>
+          <w:tcPr>
+            <w:tcW w:type="dxa" w:w="2160"/>
+            <w:shd w:fill="E8F4FD"/>
+          </w:tcPr>
+          <w:p>
+            <w:r>
+              <w:rPr>
+                <w:sz w:val="20"/>
+              </w:rPr>
+              <w:t>Support</w:t>
+            </w:r>
+          </w:p>
+        </w:tc>
+        <w:tc>
+          <w:tcPr>
+            <w:tcW w:type="dxa" w:w="2160"/>
+            <w:shd w:fill="E8F4FD"/>
+          </w:tcPr>
+          <w:p>
+            <w:r>
+              <w:rPr>
+                <w:sz w:val="20"/>
+              </w:rPr>
+              <w:t>Community / docs</w:t>
+            </w:r>
+          </w:p>
+        </w:tc>
+        <w:tc>
+          <w:tcPr>
+            <w:tcW w:type="dxa" w:w="2592"/>
+            <w:shd w:fill="E8F4FD"/>
+          </w:tcPr>
+          <w:p>
+            <w:r>
+              <w:rPr>
+                <w:sz w:val="20"/>
+              </w:rPr>
+              <w:t>Email support</w:t>
+            </w:r>
+          </w:p>
+        </w:tc>
+        <w:tc>
+          <w:tcPr>
+            <w:tcW w:type="dxa" w:w="2448"/>
+            <w:shd w:fill="E8F4FD"/>
+          </w:tcPr>
+          <w:p>
+            <w:r>
+              <w:rPr>
+                <w:sz w:val="20"/>
+              </w:rPr>
+              <w:t>Dedicated support engineer</w:t>
+            </w:r>
+          </w:p>
+        </w:tc>
+      </w:tr>
+    </w:tbl>
+    <w:p>
+      <w:pPr>
+        <w:pStyle w:val="Heading1"/>
+      </w:pPr>
+      <w:r>
+        <w:rPr>
+          <w:color w:val="002B5C"/>
+        </w:rPr>
+        <w:t>3. System Architecture</w:t>
       </w:r>
     </w:p>
     <w:p>
@@ -1425,12 +2039,7 @@
         <w:rPr>
           <w:color w:val="002B5C"/>
         </w:rPr>
-        <w:t>3. Roles &amp; Permissions</w:t>
-      </w:r>
-    </w:p>
-    <w:p>
-      <w:r>
-        <w:t>Every API endpoint checks the user's role before allowing access. The permissions matrix below shows which roles can access which features. This is enforced at the middleware level.</w:t>
+        <w:t>4. Roles &amp; Permissions</w:t>
       </w:r>
     </w:p>
     <w:tbl>
@@ -3479,12 +4088,12 @@
         <w:rPr>
           <w:color w:val="002B5C"/>
         </w:rPr>
-        <w:t>4. Database Schema</w:t>
+        <w:t>5. Database Schema</w:t>
       </w:r>
     </w:p>
     <w:p>
       <w:r>
-        <w:t>The database stores all business data. Below are the main tables and their structures. Each table represents a concept in the business (users, products, orders, etc.).</w:t>
+        <w:t>The database stores all business data. Below are the main tables with descriptions.</w:t>
       </w:r>
     </w:p>
     <w:p>
@@ -3495,7 +4104,7 @@
         <w:rPr>
           <w:color w:val="002B5C"/>
         </w:rPr>
-        <w:t>4.x users</w:t>
+        <w:t>5.x users</w:t>
       </w:r>
     </w:p>
     <w:p>
@@ -3507,7 +4116,7 @@
         <w:t xml:space="preserve">Purpose: </w:t>
       </w:r>
       <w:r>
-        <w:t>System users who can log in. Each user has a role that determines their access level.</w:t>
+        <w:t>System users with login credentials and role assignments.</w:t>
       </w:r>
     </w:p>
     <w:p>
@@ -3518,7 +4127,7 @@
         <w:rPr>
           <w:color w:val="002B5C"/>
         </w:rPr>
-        <w:t>4.x roles</w:t>
+        <w:t>5.x roles</w:t>
       </w:r>
     </w:p>
     <w:p>
@@ -3530,7 +4139,7 @@
         <w:t xml:space="preserve">Purpose: </w:t>
       </w:r>
       <w:r>
-        <w:t>Defines what each role can do. Permissions are stored as JSON for flexibility.</w:t>
+        <w:t>Permission sets that control what each user can access.</w:t>
       </w:r>
     </w:p>
     <w:p>
@@ -3541,7 +4150,7 @@
         <w:rPr>
           <w:color w:val="002B5C"/>
         </w:rPr>
-        <w:t>4.x companies</w:t>
+        <w:t>5.x companies</w:t>
       </w:r>
     </w:p>
     <w:p>
@@ -3553,7 +4162,7 @@
         <w:t xml:space="preserve">Purpose: </w:t>
       </w:r>
       <w:r>
-        <w:t>Company information. OneGemmy supports multi-tenancy — each company has its own data.</w:t>
+        <w:t>Company information supporting multi-tenancy (each company has its own data).</w:t>
       </w:r>
     </w:p>
     <w:p>
@@ -3564,7 +4173,7 @@
         <w:rPr>
           <w:color w:val="002B5C"/>
         </w:rPr>
-        <w:t>4.x leads</w:t>
+        <w:t>5.x leads</w:t>
       </w:r>
     </w:p>
     <w:p>
@@ -3576,7 +4185,7 @@
         <w:t xml:space="preserve">Purpose: </w:t>
       </w:r>
       <w:r>
-        <w:t>Potential customers captured from various sources. Tracks status from new to converted.</w:t>
+        <w:t>Potential customers from various sources, tracked from new to converted.</w:t>
       </w:r>
     </w:p>
     <w:p>
@@ -3587,7 +4196,7 @@
         <w:rPr>
           <w:color w:val="002B5C"/>
         </w:rPr>
-        <w:t>4.x deals</w:t>
+        <w:t>5.x deals</w:t>
       </w:r>
     </w:p>
     <w:p>
@@ -3599,7 +4208,7 @@
         <w:t xml:space="preserve">Purpose: </w:t>
       </w:r>
       <w:r>
-        <w:t>Sales opportunities linked to contacts. Tracks the sales pipeline from prospecting to close.</w:t>
+        <w:t>Sales opportunities in the pipeline from prospecting to close.</w:t>
       </w:r>
     </w:p>
     <w:p>
@@ -3610,7 +4219,7 @@
         <w:rPr>
           <w:color w:val="002B5C"/>
         </w:rPr>
-        <w:t>4.x quotes</w:t>
+        <w:t>5.x quotes</w:t>
       </w:r>
     </w:p>
     <w:p>
@@ -3622,7 +4231,7 @@
         <w:t xml:space="preserve">Purpose: </w:t>
       </w:r>
       <w:r>
-        <w:t>Price quotations sent to customers. Supports versioning, approval workflow, and PDF generation.</w:t>
+        <w:t>Price quotations with versioning, approval workflow, and PDF generation.</w:t>
       </w:r>
     </w:p>
     <w:p>
@@ -3633,7 +4242,7 @@
         <w:rPr>
           <w:color w:val="002B5C"/>
         </w:rPr>
-        <w:t>4.x quote_items</w:t>
+        <w:t>5.x quote_items</w:t>
       </w:r>
     </w:p>
     <w:p>
@@ -3656,7 +4265,7 @@
         <w:rPr>
           <w:color w:val="002B5C"/>
         </w:rPr>
-        <w:t>4.x sales_orders</w:t>
+        <w:t>5.x sales_orders</w:t>
       </w:r>
     </w:p>
     <w:p>
@@ -3668,7 +4277,7 @@
         <w:t xml:space="preserve">Purpose: </w:t>
       </w:r>
       <w:r>
-        <w:t>Confirmed orders from accepted quotes. Tracks fulfillment from pending to delivered.</w:t>
+        <w:t>Confirmed orders from accepted quotes, tracked through fulfillment.</w:t>
       </w:r>
     </w:p>
     <w:p>
@@ -3679,7 +4288,7 @@
         <w:rPr>
           <w:color w:val="002B5C"/>
         </w:rPr>
-        <w:t>4.x sales_order_items</w:t>
+        <w:t>5.x sales_order_items</w:t>
       </w:r>
     </w:p>
     <w:p>
@@ -3691,7 +4300,7 @@
         <w:t xml:space="preserve">Purpose: </w:t>
       </w:r>
       <w:r>
-        <w:t>Individual line items on a sales order with fulfillment tracking.</w:t>
+        <w:t>Line items on orders with fulfillment tracking.</w:t>
       </w:r>
     </w:p>
     <w:p>
@@ -3702,7 +4311,7 @@
         <w:rPr>
           <w:color w:val="002B5C"/>
         </w:rPr>
-        <w:t>4.x sales_targets</w:t>
+        <w:t>5.x sales_targets</w:t>
       </w:r>
     </w:p>
     <w:p>
@@ -3714,7 +4323,7 @@
         <w:t xml:space="preserve">Purpose: </w:t>
       </w:r>
       <w:r>
-        <w:t>Sales quotas set per rep per period (monthly/quarterly/yearly).</w:t>
+        <w:t>Sales quotas per rep per period (monthly/quarterly/yearly).</w:t>
       </w:r>
     </w:p>
     <w:p>
@@ -3725,7 +4334,7 @@
         <w:rPr>
           <w:color w:val="002B5C"/>
         </w:rPr>
-        <w:t>4.x commissions</w:t>
+        <w:t>5.x commissions</w:t>
       </w:r>
     </w:p>
     <w:p>
@@ -3737,7 +4346,7 @@
         <w:t xml:space="preserve">Purpose: </w:t>
       </w:r>
       <w:r>
-        <w:t>Commission records calculated when deals close. Tracks approval and payment status.</w:t>
+        <w:t>Commission records with approval and payment tracking.</w:t>
       </w:r>
     </w:p>
     <w:p>
@@ -3748,7 +4357,7 @@
         <w:rPr>
           <w:color w:val="002B5C"/>
         </w:rPr>
-        <w:t>4.x commission_rules</w:t>
+        <w:t>5.x commission_rules</w:t>
       </w:r>
     </w:p>
     <w:p>
@@ -3760,7 +4369,7 @@
         <w:t xml:space="preserve">Purpose: </w:t>
       </w:r>
       <w:r>
-        <w:t>Rules that define how commissions are calculated (flat, tiered, graduated).</w:t>
+        <w:t>Rules defining how commissions are calculated.</w:t>
       </w:r>
     </w:p>
     <w:p>
@@ -3771,7 +4380,7 @@
         <w:rPr>
           <w:color w:val="002B5C"/>
         </w:rPr>
-        <w:t>4.x sales_activities</w:t>
+        <w:t>5.x sales_activities</w:t>
       </w:r>
     </w:p>
     <w:p>
@@ -3783,7 +4392,7 @@
         <w:t xml:space="preserve">Purpose: </w:t>
       </w:r>
       <w:r>
-        <w:t>Log of all sales interactions (calls, emails, meetings, notes).</w:t>
+        <w:t>Log of all sales interactions (calls, emails, meetings).</w:t>
       </w:r>
     </w:p>
     <w:p>
@@ -3794,7 +4403,7 @@
         <w:rPr>
           <w:color w:val="002B5C"/>
         </w:rPr>
-        <w:t>4.x products</w:t>
+        <w:t>5.x products</w:t>
       </w:r>
     </w:p>
     <w:p>
@@ -3806,7 +4415,7 @@
         <w:t xml:space="preserve">Purpose: </w:t>
       </w:r>
       <w:r>
-        <w:t>Product catalog with SKUs, pricing, cost, and stock quantities.</w:t>
+        <w:t>Product catalog with SKUs, pricing, cost, and stock info.</w:t>
       </w:r>
     </w:p>
     <w:p>
@@ -3817,7 +4426,7 @@
         <w:rPr>
           <w:color w:val="002B5C"/>
         </w:rPr>
-        <w:t>4.x product_categories</w:t>
+        <w:t>5.x product_categories</w:t>
       </w:r>
     </w:p>
     <w:p>
@@ -3840,7 +4449,7 @@
         <w:rPr>
           <w:color w:val="002B5C"/>
         </w:rPr>
-        <w:t>4.x product_variants</w:t>
+        <w:t>5.x product_variants</w:t>
       </w:r>
     </w:p>
     <w:p>
@@ -3852,7 +4461,7 @@
         <w:t xml:space="preserve">Purpose: </w:t>
       </w:r>
       <w:r>
-        <w:t>Product variations (size, color) with independent stock and pricing.</w:t>
+        <w:t>Product variations with independent stock and pricing.</w:t>
       </w:r>
     </w:p>
     <w:p>
@@ -3863,7 +4472,7 @@
         <w:rPr>
           <w:color w:val="002B5C"/>
         </w:rPr>
-        <w:t>4.x warehouses</w:t>
+        <w:t>5.x warehouses</w:t>
       </w:r>
     </w:p>
     <w:p>
@@ -3886,7 +4495,7 @@
         <w:rPr>
           <w:color w:val="002B5C"/>
         </w:rPr>
-        <w:t>4.x stock_levels</w:t>
+        <w:t>5.x stock_levels</w:t>
       </w:r>
     </w:p>
     <w:p>
@@ -3898,7 +4507,7 @@
         <w:t xml:space="preserve">Purpose: </w:t>
       </w:r>
       <w:r>
-        <w:t>Current stock quantity per product per warehouse with reserved quantities.</w:t>
+        <w:t>Current stock per product per warehouse with reserved quantities.</w:t>
       </w:r>
     </w:p>
     <w:p>
@@ -3909,7 +4518,7 @@
         <w:rPr>
           <w:color w:val="002B5C"/>
         </w:rPr>
-        <w:t>4.x stock_movements</w:t>
+        <w:t>5.x stock_movements</w:t>
       </w:r>
     </w:p>
     <w:p>
@@ -3921,7 +4530,7 @@
         <w:t xml:space="preserve">Purpose: </w:t>
       </w:r>
       <w:r>
-        <w:t>Audit trail of every stock change (in, out, transfer, adjustment).</w:t>
+        <w:t>Audit trail of every stock change.</w:t>
       </w:r>
     </w:p>
     <w:p>
@@ -3932,7 +4541,7 @@
         <w:rPr>
           <w:color w:val="002B5C"/>
         </w:rPr>
-        <w:t>4.x stock_adjustments</w:t>
+        <w:t>5.x stock_adjustments</w:t>
       </w:r>
     </w:p>
     <w:p>
@@ -3955,30 +4564,7 @@
         <w:rPr>
           <w:color w:val="002B5C"/>
         </w:rPr>
-        <w:t>4.x stock_adjustment_items</w:t>
-      </w:r>
-    </w:p>
-    <w:p>
-      <w:r>
-        <w:rPr>
-          <w:b/>
-          <w:color w:val="0070C0"/>
-        </w:rPr>
-        <w:t xml:space="preserve">Purpose: </w:t>
-      </w:r>
-      <w:r>
-        <w:t>Individual products affected by a stock adjustment.</w:t>
-      </w:r>
-    </w:p>
-    <w:p>
-      <w:pPr>
-        <w:pStyle w:val="Heading2"/>
-      </w:pPr>
-      <w:r>
-        <w:rPr>
-          <w:color w:val="002B5C"/>
-        </w:rPr>
-        <w:t>4.x stock_transfers</w:t>
+        <w:t>5.x stock_transfers</w:t>
       </w:r>
     </w:p>
     <w:p>
@@ -4001,30 +4587,7 @@
         <w:rPr>
           <w:color w:val="002B5C"/>
         </w:rPr>
-        <w:t>4.x stock_transfer_items</w:t>
-      </w:r>
-    </w:p>
-    <w:p>
-      <w:r>
-        <w:rPr>
-          <w:b/>
-          <w:color w:val="0070C0"/>
-        </w:rPr>
-        <w:t xml:space="preserve">Purpose: </w:t>
-      </w:r>
-      <w:r>
-        <w:t>Products being transferred with quantities sent and received.</w:t>
-      </w:r>
-    </w:p>
-    <w:p>
-      <w:pPr>
-        <w:pStyle w:val="Heading2"/>
-      </w:pPr>
-      <w:r>
-        <w:rPr>
-          <w:color w:val="002B5C"/>
-        </w:rPr>
-        <w:t>4.x stock_takes</w:t>
+        <w:t>5.x stock_takes</w:t>
       </w:r>
     </w:p>
     <w:p>
@@ -4047,7 +4610,7 @@
         <w:rPr>
           <w:color w:val="002B5C"/>
         </w:rPr>
-        <w:t>4.x stock_take_items</w:t>
+        <w:t>5.x suppliers</w:t>
       </w:r>
     </w:p>
     <w:p>
@@ -4059,7 +4622,7 @@
         <w:t xml:space="preserve">Purpose: </w:t>
       </w:r>
       <w:r>
-        <w:t>Individual products counted with system vs physical comparison.</w:t>
+        <w:t>Supplier directory with performance tracking.</w:t>
       </w:r>
     </w:p>
     <w:p>
@@ -4070,30 +4633,7 @@
         <w:rPr>
           <w:color w:val="002B5C"/>
         </w:rPr>
-        <w:t>4.x suppliers</w:t>
-      </w:r>
-    </w:p>
-    <w:p>
-      <w:r>
-        <w:rPr>
-          <w:b/>
-          <w:color w:val="0070C0"/>
-        </w:rPr>
-        <w:t xml:space="preserve">Purpose: </w:t>
-      </w:r>
-      <w:r>
-        <w:t>Supplier directory with contact info and performance ratings.</w:t>
-      </w:r>
-    </w:p>
-    <w:p>
-      <w:pPr>
-        <w:pStyle w:val="Heading2"/>
-      </w:pPr>
-      <w:r>
-        <w:rPr>
-          <w:color w:val="002B5C"/>
-        </w:rPr>
-        <w:t>4.x purchase_orders</w:t>
+        <w:t>5.x purchase_orders</w:t>
       </w:r>
     </w:p>
     <w:p>
@@ -4116,30 +4656,7 @@
         <w:rPr>
           <w:color w:val="002B5C"/>
         </w:rPr>
-        <w:t>4.x purchase_order_items</w:t>
-      </w:r>
-    </w:p>
-    <w:p>
-      <w:r>
-        <w:rPr>
-          <w:b/>
-          <w:color w:val="0070C0"/>
-        </w:rPr>
-        <w:t xml:space="preserve">Purpose: </w:t>
-      </w:r>
-      <w:r>
-        <w:t>Individual products ordered from suppliers with receipt tracking.</w:t>
-      </w:r>
-    </w:p>
-    <w:p>
-      <w:pPr>
-        <w:pStyle w:val="Heading2"/>
-      </w:pPr>
-      <w:r>
-        <w:rPr>
-          <w:color w:val="002B5C"/>
-        </w:rPr>
-        <w:t>4.x invoices</w:t>
+        <w:t>5.x invoices</w:t>
       </w:r>
     </w:p>
     <w:p>
@@ -4162,7 +4679,7 @@
         <w:rPr>
           <w:color w:val="002B5C"/>
         </w:rPr>
-        <w:t>4.x invoice_items</w:t>
+        <w:t>5.x invoice_items</w:t>
       </w:r>
     </w:p>
     <w:p>
@@ -4185,7 +4702,7 @@
         <w:rPr>
           <w:color w:val="002B5C"/>
         </w:rPr>
-        <w:t>4.x contacts</w:t>
+        <w:t>5.x contacts</w:t>
       </w:r>
     </w:p>
     <w:p>
@@ -4197,7 +4714,7 @@
         <w:t xml:space="preserve">Purpose: </w:t>
       </w:r>
       <w:r>
-        <w:t>All external people (customers, vendors, leads) with segmentation.</w:t>
+        <w:t>All external people (customers, vendors, leads).</w:t>
       </w:r>
     </w:p>
     <w:p>
@@ -4208,7 +4725,7 @@
         <w:rPr>
           <w:color w:val="002B5C"/>
         </w:rPr>
-        <w:t>4.x employees</w:t>
+        <w:t>5.x employees</w:t>
       </w:r>
     </w:p>
     <w:p>
@@ -4220,7 +4737,7 @@
         <w:t xml:space="preserve">Purpose: </w:t>
       </w:r>
       <w:r>
-        <w:t>Employee records linked to users with department and salary info.</w:t>
+        <w:t>Employee records linked to users.</w:t>
       </w:r>
     </w:p>
     <w:p>
@@ -4231,7 +4748,7 @@
         <w:rPr>
           <w:color w:val="002B5C"/>
         </w:rPr>
-        <w:t>4.x departments</w:t>
+        <w:t>5.x projects</w:t>
       </w:r>
     </w:p>
     <w:p>
@@ -4243,7 +4760,7 @@
         <w:t xml:space="preserve">Purpose: </w:t>
       </w:r>
       <w:r>
-        <w:t>Organizational departments with designated heads.</w:t>
+        <w:t>Business projects with status, priority, and timeline.</w:t>
       </w:r>
     </w:p>
     <w:p>
@@ -4254,7 +4771,7 @@
         <w:rPr>
           <w:color w:val="002B5C"/>
         </w:rPr>
-        <w:t>4.x projects</w:t>
+        <w:t>5.x tasks</w:t>
       </w:r>
     </w:p>
     <w:p>
@@ -4266,7 +4783,7 @@
         <w:t xml:space="preserve">Purpose: </w:t>
       </w:r>
       <w:r>
-        <w:t>Business projects with status, priority, budget, and timeline.</w:t>
+        <w:t>Individual tasks within projects.</w:t>
       </w:r>
     </w:p>
     <w:p>
@@ -4277,30 +4794,7 @@
         <w:rPr>
           <w:color w:val="002B5C"/>
         </w:rPr>
-        <w:t>4.x tasks</w:t>
-      </w:r>
-    </w:p>
-    <w:p>
-      <w:r>
-        <w:rPr>
-          <w:b/>
-          <w:color w:val="0070C0"/>
-        </w:rPr>
-        <w:t xml:space="preserve">Purpose: </w:t>
-      </w:r>
-      <w:r>
-        <w:t>Individual tasks within projects assigned to team members.</w:t>
-      </w:r>
-    </w:p>
-    <w:p>
-      <w:pPr>
-        <w:pStyle w:val="Heading2"/>
-      </w:pPr>
-      <w:r>
-        <w:rPr>
-          <w:color w:val="002B5C"/>
-        </w:rPr>
-        <w:t>4.x activity_logs</w:t>
+        <w:t>5.x activity_logs</w:t>
       </w:r>
     </w:p>
     <w:p>
@@ -4323,1237 +4817,7 @@
         <w:rPr>
           <w:color w:val="002B5C"/>
         </w:rPr>
-        <w:t>5. API Endpoints</w:t>
-      </w:r>
-    </w:p>
-    <w:p>
-      <w:r>
-        <w:t>The backend exposes RESTful API endpoints that the frontend calls. Each endpoint has a specific HTTP method (GET, POST, PUT, DELETE) and requires certain user permissions.</w:t>
-      </w:r>
-    </w:p>
-    <w:p>
-      <w:pPr>
-        <w:pStyle w:val="Heading2"/>
-      </w:pPr>
-      <w:r>
-        <w:rPr>
-          <w:color w:val="002B5C"/>
-        </w:rPr>
-        <w:t>Authentication (/api/auth)</w:t>
-      </w:r>
-    </w:p>
-    <w:p>
-      <w:r>
-        <w:t>Handles user login, registration, password reset, and session management.</w:t>
-      </w:r>
-    </w:p>
-    <w:p>
-      <w:pPr>
-        <w:pStyle w:val="Heading2"/>
-      </w:pPr>
-      <w:r>
-        <w:rPr>
-          <w:color w:val="002B5C"/>
-        </w:rPr>
-        <w:t>Sales — Leads (/api/sales/leads)</w:t>
-      </w:r>
-    </w:p>
-    <w:p>
-      <w:r>
-        <w:t>Full CRUD for leads plus status changes, assignment, scoring, import, and conversion to deals.</w:t>
-      </w:r>
-    </w:p>
-    <w:p>
-      <w:pPr>
-        <w:pStyle w:val="Heading2"/>
-      </w:pPr>
-      <w:r>
-        <w:rPr>
-          <w:color w:val="002B5C"/>
-        </w:rPr>
-        <w:t>Sales — Pipeline (/api/sales/pipeline)</w:t>
-      </w:r>
-    </w:p>
-    <w:p>
-      <w:r>
-        <w:t>Pipeline view, forecast, funnel analytics, and stage management.</w:t>
-      </w:r>
-    </w:p>
-    <w:p>
-      <w:pPr>
-        <w:pStyle w:val="Heading2"/>
-      </w:pPr>
-      <w:r>
-        <w:rPr>
-          <w:color w:val="002B5C"/>
-        </w:rPr>
-        <w:t>Sales — Deals (/api/sales/deals)</w:t>
-      </w:r>
-    </w:p>
-    <w:p>
-      <w:r>
-        <w:t>Deal CRUD with stage movement and close (won/lost) functionality.</w:t>
-      </w:r>
-    </w:p>
-    <w:p>
-      <w:pPr>
-        <w:pStyle w:val="Heading2"/>
-      </w:pPr>
-      <w:r>
-        <w:rPr>
-          <w:color w:val="002B5C"/>
-        </w:rPr>
-        <w:t>Sales — Quotes (/api/sales/quotes)</w:t>
-      </w:r>
-    </w:p>
-    <w:p>
-      <w:r>
-        <w:t>Quote lifecycle from draft to acceptance, including PDF generation and versioning.</w:t>
-      </w:r>
-    </w:p>
-    <w:p>
-      <w:pPr>
-        <w:pStyle w:val="Heading2"/>
-      </w:pPr>
-      <w:r>
-        <w:rPr>
-          <w:color w:val="002B5C"/>
-        </w:rPr>
-        <w:t>Sales — Orders (/api/sales/orders)</w:t>
-      </w:r>
-    </w:p>
-    <w:p>
-      <w:r>
-        <w:t>Sales order management from creation through fulfillment and returns.</w:t>
-      </w:r>
-    </w:p>
-    <w:p>
-      <w:pPr>
-        <w:pStyle w:val="Heading2"/>
-      </w:pPr>
-      <w:r>
-        <w:rPr>
-          <w:color w:val="002B5C"/>
-        </w:rPr>
-        <w:t>Sales — Targets (/api/sales/targets)</w:t>
-      </w:r>
-    </w:p>
-    <w:p>
-      <w:r>
-        <w:t>Target CRUD, performance tracking, and team leaderboard.</w:t>
-      </w:r>
-    </w:p>
-    <w:p>
-      <w:pPr>
-        <w:pStyle w:val="Heading2"/>
-      </w:pPr>
-      <w:r>
-        <w:rPr>
-          <w:color w:val="002B5C"/>
-        </w:rPr>
-        <w:t>Sales — Commissions (/api/sales/commissions)</w:t>
-      </w:r>
-    </w:p>
-    <w:p>
-      <w:r>
-        <w:t>Commission tracking, approval, payment, and rule management.</w:t>
-      </w:r>
-    </w:p>
-    <w:p>
-      <w:pPr>
-        <w:pStyle w:val="Heading2"/>
-      </w:pPr>
-      <w:r>
-        <w:rPr>
-          <w:color w:val="002B5C"/>
-        </w:rPr>
-        <w:t>Sales — Activities (/api/sales/activities)</w:t>
-      </w:r>
-    </w:p>
-    <w:p>
-      <w:r>
-        <w:t>Log and schedule sales activities (calls, emails, meetings).</w:t>
-      </w:r>
-    </w:p>
-    <w:p>
-      <w:pPr>
-        <w:pStyle w:val="Heading2"/>
-      </w:pPr>
-      <w:r>
-        <w:rPr>
-          <w:color w:val="002B5C"/>
-        </w:rPr>
-        <w:t>Sales — Analytics (/api/sales/analytics)</w:t>
-      </w:r>
-    </w:p>
-    <w:p>
-      <w:r>
-        <w:t>Revenue, performance, win/loss, forecasting, and activity reports.</w:t>
-      </w:r>
-    </w:p>
-    <w:p>
-      <w:pPr>
-        <w:pStyle w:val="Heading2"/>
-      </w:pPr>
-      <w:r>
-        <w:rPr>
-          <w:color w:val="002B5C"/>
-        </w:rPr>
-        <w:t>Stock — Levels (/api/stock)</w:t>
-      </w:r>
-    </w:p>
-    <w:p>
-      <w:r>
-        <w:t>Real-time stock levels, alerts, movements, and summaries.</w:t>
-      </w:r>
-    </w:p>
-    <w:p>
-      <w:pPr>
-        <w:pStyle w:val="Heading2"/>
-      </w:pPr>
-      <w:r>
-        <w:rPr>
-          <w:color w:val="002B5C"/>
-        </w:rPr>
-        <w:t>Stock — Adjustments (/api/stock/adjustments)</w:t>
-      </w:r>
-    </w:p>
-    <w:p>
-      <w:r>
-        <w:t>Create and approve stock corrections with audit trail.</w:t>
-      </w:r>
-    </w:p>
-    <w:p>
-      <w:pPr>
-        <w:pStyle w:val="Heading2"/>
-      </w:pPr>
-      <w:r>
-        <w:rPr>
-          <w:color w:val="002B5C"/>
-        </w:rPr>
-        <w:t>Stock — Transfers (/api/stock/transfers)</w:t>
-      </w:r>
-    </w:p>
-    <w:p>
-      <w:r>
-        <w:t>Move stock between warehouses with full tracking.</w:t>
-      </w:r>
-    </w:p>
-    <w:p>
-      <w:pPr>
-        <w:pStyle w:val="Heading2"/>
-      </w:pPr>
-      <w:r>
-        <w:rPr>
-          <w:color w:val="002B5C"/>
-        </w:rPr>
-        <w:t>Stock — Takes (/api/stock/takes)</w:t>
-      </w:r>
-    </w:p>
-    <w:p>
-      <w:r>
-        <w:t>Physical inventory counts with variance reporting.</w:t>
-      </w:r>
-    </w:p>
-    <w:p>
-      <w:pPr>
-        <w:pStyle w:val="Heading2"/>
-      </w:pPr>
-      <w:r>
-        <w:rPr>
-          <w:color w:val="002B5C"/>
-        </w:rPr>
-        <w:t>Warehouses (/api/warehouses)</w:t>
-      </w:r>
-    </w:p>
-    <w:p>
-      <w:r>
-        <w:t>Warehouse CRUD with stock overview.</w:t>
-      </w:r>
-    </w:p>
-    <w:p>
-      <w:pPr>
-        <w:pStyle w:val="Heading2"/>
-      </w:pPr>
-      <w:r>
-        <w:rPr>
-          <w:color w:val="002B5C"/>
-        </w:rPr>
-        <w:t>Suppliers (/api/suppliers)</w:t>
-      </w:r>
-    </w:p>
-    <w:p>
-      <w:r>
-        <w:t>Supplier directory with performance tracking.</w:t>
-      </w:r>
-    </w:p>
-    <w:p>
-      <w:pPr>
-        <w:pStyle w:val="Heading2"/>
-      </w:pPr>
-      <w:r>
-        <w:rPr>
-          <w:color w:val="002B5C"/>
-        </w:rPr>
-        <w:t>Purchase Orders (/api/purchase-orders)</w:t>
-      </w:r>
-    </w:p>
-    <w:p>
-      <w:r>
-        <w:t>PO lifecycle from creation to goods receipt.</w:t>
-      </w:r>
-    </w:p>
-    <w:p>
-      <w:pPr>
-        <w:pStyle w:val="Heading2"/>
-      </w:pPr>
-      <w:r>
-        <w:rPr>
-          <w:color w:val="002B5C"/>
-        </w:rPr>
-        <w:t>Products (/api/products)</w:t>
-      </w:r>
-    </w:p>
-    <w:p>
-      <w:r>
-        <w:t>Product catalog with variants, categories, and stock info.</w:t>
-      </w:r>
-    </w:p>
-    <w:p>
-      <w:pPr>
-        <w:pStyle w:val="Heading2"/>
-      </w:pPr>
-      <w:r>
-        <w:rPr>
-          <w:color w:val="002B5C"/>
-        </w:rPr>
-        <w:t>Invoices (/api/invoices)</w:t>
-      </w:r>
-    </w:p>
-    <w:p>
-      <w:r>
-        <w:t>Invoice management with PDF generation.</w:t>
-      </w:r>
-    </w:p>
-    <w:p>
-      <w:pPr>
-        <w:pStyle w:val="Heading2"/>
-      </w:pPr>
-      <w:r>
-        <w:rPr>
-          <w:color w:val="002B5C"/>
-        </w:rPr>
-        <w:t>Expenses (/api/expenses)</w:t>
-      </w:r>
-    </w:p>
-    <w:p>
-      <w:r>
-        <w:t>Expense tracking with approval workflow.</w:t>
-      </w:r>
-    </w:p>
-    <w:p>
-      <w:pPr>
-        <w:pStyle w:val="Heading2"/>
-      </w:pPr>
-      <w:r>
-        <w:rPr>
-          <w:color w:val="002B5C"/>
-        </w:rPr>
-        <w:t>Employees (/api/employees)</w:t>
-      </w:r>
-    </w:p>
-    <w:p>
-      <w:r>
-        <w:t>Employee directory and profile management.</w:t>
-      </w:r>
-    </w:p>
-    <w:p>
-      <w:pPr>
-        <w:pStyle w:val="Heading2"/>
-      </w:pPr>
-      <w:r>
-        <w:rPr>
-          <w:color w:val="002B5C"/>
-        </w:rPr>
-        <w:t>Projects (/api/projects)</w:t>
-      </w:r>
-    </w:p>
-    <w:p>
-      <w:r>
-        <w:t>Project and task management.</w:t>
-      </w:r>
-    </w:p>
-    <w:p>
-      <w:pPr>
-        <w:pStyle w:val="Heading2"/>
-      </w:pPr>
-      <w:r>
-        <w:rPr>
-          <w:color w:val="002B5C"/>
-        </w:rPr>
-        <w:t>Contacts (/api/contacts)</w:t>
-      </w:r>
-    </w:p>
-    <w:p>
-      <w:r>
-        <w:t>CRM contact management.</w:t>
-      </w:r>
-    </w:p>
-    <w:p>
-      <w:pPr>
-        <w:pStyle w:val="Heading2"/>
-      </w:pPr>
-      <w:r>
-        <w:rPr>
-          <w:color w:val="002B5C"/>
-        </w:rPr>
-        <w:t>Reports (/api/reports)</w:t>
-      </w:r>
-    </w:p>
-    <w:p>
-      <w:r>
-        <w:t>Financial, sales, and inventory report generation.</w:t>
-      </w:r>
-    </w:p>
-    <w:p>
-      <w:pPr>
-        <w:pStyle w:val="Heading2"/>
-      </w:pPr>
-      <w:r>
-        <w:rPr>
-          <w:color w:val="002B5C"/>
-        </w:rPr>
-        <w:t>Settings (/api/settings)</w:t>
-      </w:r>
-    </w:p>
-    <w:p>
-      <w:r>
-        <w:t>System configuration and role management.</w:t>
-      </w:r>
-    </w:p>
-    <w:p>
-      <w:pPr>
-        <w:pStyle w:val="Heading2"/>
-      </w:pPr>
-      <w:r>
-        <w:rPr>
-          <w:color w:val="002B5C"/>
-        </w:rPr>
-        <w:t>Audit Logs (/api/audit)</w:t>
-      </w:r>
-    </w:p>
-    <w:p>
-      <w:r>
-        <w:t>System-wide activity audit trail.</w:t>
-      </w:r>
-    </w:p>
-    <w:p>
-      <w:pPr>
-        <w:pStyle w:val="Heading1"/>
-      </w:pPr>
-      <w:r>
-        <w:rPr>
-          <w:color w:val="002B5C"/>
-        </w:rPr>
-        <w:t>6. Non-Functional Requirements</w:t>
-      </w:r>
-    </w:p>
-    <w:p>
-      <w:pPr>
-        <w:pStyle w:val="Heading2"/>
-      </w:pPr>
-      <w:r>
-        <w:rPr>
-          <w:color w:val="002B5C"/>
-        </w:rPr>
-        <w:t>6.1 Performance</w:t>
-      </w:r>
-    </w:p>
-    <w:p>
-      <w:r>
-        <w:t>The backend must respond quickly even under heavy load.</w:t>
-      </w:r>
-    </w:p>
-    <w:tbl>
-      <w:tblPr>
-        <w:tblStyle w:val="TableGrid"/>
-        <w:tblW w:type="auto" w:w="0"/>
-        <w:jc w:val="center"/>
-        <w:tblLook w:firstColumn="1" w:firstRow="1" w:lastColumn="0" w:lastRow="0" w:noHBand="0" w:noVBand="1" w:val="04A0"/>
-      </w:tblPr>
-      <w:tblGrid>
-        <w:gridCol w:w="4703"/>
-        <w:gridCol w:w="4703"/>
-      </w:tblGrid>
-      <w:tr>
-        <w:tc>
-          <w:tcPr>
-            <w:tcW w:type="dxa" w:w="2160"/>
-            <w:shd w:fill="0070C0"/>
-          </w:tcPr>
-          <w:p>
-            <w:pPr>
-              <w:jc w:val="center"/>
-            </w:pPr>
-            <w:r>
-              <w:rPr>
-                <w:b/>
-                <w:color w:val="FFFFFF"/>
-                <w:sz w:val="20"/>
-              </w:rPr>
-              <w:t>ID</w:t>
-            </w:r>
-          </w:p>
-        </w:tc>
-        <w:tc>
-          <w:tcPr>
-            <w:tcW w:type="dxa" w:w="7200"/>
-            <w:shd w:fill="0070C0"/>
-          </w:tcPr>
-          <w:p>
-            <w:pPr>
-              <w:jc w:val="center"/>
-            </w:pPr>
-            <w:r>
-              <w:rPr>
-                <w:b/>
-                <w:color w:val="FFFFFF"/>
-                <w:sz w:val="20"/>
-              </w:rPr>
-              <w:t>Requirement</w:t>
-            </w:r>
-          </w:p>
-        </w:tc>
-      </w:tr>
-      <w:tr>
-        <w:tc>
-          <w:tcPr>
-            <w:tcW w:type="dxa" w:w="2160"/>
-          </w:tcPr>
-          <w:p>
-            <w:r>
-              <w:rPr>
-                <w:sz w:val="20"/>
-              </w:rPr>
-              <w:t>NFR-PERF-001</w:t>
-            </w:r>
-          </w:p>
-        </w:tc>
-        <w:tc>
-          <w:tcPr>
-            <w:tcW w:type="dxa" w:w="7200"/>
-          </w:tcPr>
-          <w:p>
-            <w:r>
-              <w:rPr>
-                <w:sz w:val="20"/>
-              </w:rPr>
-              <w:t>API response time &lt; 200ms (95th percentile)</w:t>
-            </w:r>
-          </w:p>
-        </w:tc>
-      </w:tr>
-      <w:tr>
-        <w:tc>
-          <w:tcPr>
-            <w:tcW w:type="dxa" w:w="2160"/>
-            <w:shd w:fill="E8F4FD"/>
-          </w:tcPr>
-          <w:p>
-            <w:r>
-              <w:rPr>
-                <w:sz w:val="20"/>
-              </w:rPr>
-              <w:t>NFR-PERF-002</w:t>
-            </w:r>
-          </w:p>
-        </w:tc>
-        <w:tc>
-          <w:tcPr>
-            <w:tcW w:type="dxa" w:w="7200"/>
-            <w:shd w:fill="E8F4FD"/>
-          </w:tcPr>
-          <w:p>
-            <w:r>
-              <w:rPr>
-                <w:sz w:val="20"/>
-              </w:rPr>
-              <w:t>Support 1000+ concurrent connections</w:t>
-            </w:r>
-          </w:p>
-        </w:tc>
-      </w:tr>
-      <w:tr>
-        <w:tc>
-          <w:tcPr>
-            <w:tcW w:type="dxa" w:w="2160"/>
-          </w:tcPr>
-          <w:p>
-            <w:r>
-              <w:rPr>
-                <w:sz w:val="20"/>
-              </w:rPr>
-              <w:t>NFR-PERF-003</w:t>
-            </w:r>
-          </w:p>
-        </w:tc>
-        <w:tc>
-          <w:tcPr>
-            <w:tcW w:type="dxa" w:w="7200"/>
-          </w:tcPr>
-          <w:p>
-            <w:r>
-              <w:rPr>
-                <w:sz w:val="20"/>
-              </w:rPr>
-              <w:t>Database query execution &lt; 100ms for indexed queries</w:t>
-            </w:r>
-          </w:p>
-        </w:tc>
-      </w:tr>
-      <w:tr>
-        <w:tc>
-          <w:tcPr>
-            <w:tcW w:type="dxa" w:w="2160"/>
-            <w:shd w:fill="E8F4FD"/>
-          </w:tcPr>
-          <w:p>
-            <w:r>
-              <w:rPr>
-                <w:sz w:val="20"/>
-              </w:rPr>
-              <w:t>NFR-PERF-004</w:t>
-            </w:r>
-          </w:p>
-        </w:tc>
-        <w:tc>
-          <w:tcPr>
-            <w:tcW w:type="dxa" w:w="7200"/>
-            <w:shd w:fill="E8F4FD"/>
-          </w:tcPr>
-          <w:p>
-            <w:r>
-              <w:rPr>
-                <w:sz w:val="20"/>
-              </w:rPr>
-              <w:t>Redis cache hit ratio &gt; 80% for frequently accessed data</w:t>
-            </w:r>
-          </w:p>
-        </w:tc>
-      </w:tr>
-      <w:tr>
-        <w:tc>
-          <w:tcPr>
-            <w:tcW w:type="dxa" w:w="2160"/>
-          </w:tcPr>
-          <w:p>
-            <w:r>
-              <w:rPr>
-                <w:sz w:val="20"/>
-              </w:rPr>
-              <w:t>NFR-PERF-005</w:t>
-            </w:r>
-          </w:p>
-        </w:tc>
-        <w:tc>
-          <w:tcPr>
-            <w:tcW w:type="dxa" w:w="7200"/>
-          </w:tcPr>
-          <w:p>
-            <w:r>
-              <w:rPr>
-                <w:sz w:val="20"/>
-              </w:rPr>
-              <w:t>Bulk operations (1000+ records) complete &lt; 5 seconds</w:t>
-            </w:r>
-          </w:p>
-        </w:tc>
-      </w:tr>
-    </w:tbl>
-    <w:p>
-      <w:pPr>
-        <w:pStyle w:val="Heading2"/>
-      </w:pPr>
-      <w:r>
-        <w:rPr>
-          <w:color w:val="002B5C"/>
-        </w:rPr>
-        <w:t>6.2 Security</w:t>
-      </w:r>
-    </w:p>
-    <w:p>
-      <w:r>
-        <w:t>Security is critical — the backend handles sensitive business and user data.</w:t>
-      </w:r>
-    </w:p>
-    <w:tbl>
-      <w:tblPr>
-        <w:tblStyle w:val="TableGrid"/>
-        <w:tblW w:type="auto" w:w="0"/>
-        <w:jc w:val="center"/>
-        <w:tblLook w:firstColumn="1" w:firstRow="1" w:lastColumn="0" w:lastRow="0" w:noHBand="0" w:noVBand="1" w:val="04A0"/>
-      </w:tblPr>
-      <w:tblGrid>
-        <w:gridCol w:w="4703"/>
-        <w:gridCol w:w="4703"/>
-      </w:tblGrid>
-      <w:tr>
-        <w:tc>
-          <w:tcPr>
-            <w:tcW w:type="dxa" w:w="2160"/>
-            <w:shd w:fill="0070C0"/>
-          </w:tcPr>
-          <w:p>
-            <w:pPr>
-              <w:jc w:val="center"/>
-            </w:pPr>
-            <w:r>
-              <w:rPr>
-                <w:b/>
-                <w:color w:val="FFFFFF"/>
-                <w:sz w:val="20"/>
-              </w:rPr>
-              <w:t>ID</w:t>
-            </w:r>
-          </w:p>
-        </w:tc>
-        <w:tc>
-          <w:tcPr>
-            <w:tcW w:type="dxa" w:w="7200"/>
-            <w:shd w:fill="0070C0"/>
-          </w:tcPr>
-          <w:p>
-            <w:pPr>
-              <w:jc w:val="center"/>
-            </w:pPr>
-            <w:r>
-              <w:rPr>
-                <w:b/>
-                <w:color w:val="FFFFFF"/>
-                <w:sz w:val="20"/>
-              </w:rPr>
-              <w:t>Requirement</w:t>
-            </w:r>
-          </w:p>
-        </w:tc>
-      </w:tr>
-      <w:tr>
-        <w:tc>
-          <w:tcPr>
-            <w:tcW w:type="dxa" w:w="2160"/>
-          </w:tcPr>
-          <w:p>
-            <w:r>
-              <w:rPr>
-                <w:sz w:val="20"/>
-              </w:rPr>
-              <w:t>NFR-SEC-001</w:t>
-            </w:r>
-          </w:p>
-        </w:tc>
-        <w:tc>
-          <w:tcPr>
-            <w:tcW w:type="dxa" w:w="7200"/>
-          </w:tcPr>
-          <w:p>
-            <w:r>
-              <w:rPr>
-                <w:sz w:val="20"/>
-              </w:rPr>
-              <w:t>Passwords hashed with bcrypt (12 salt rounds)</w:t>
-            </w:r>
-          </w:p>
-        </w:tc>
-      </w:tr>
-      <w:tr>
-        <w:tc>
-          <w:tcPr>
-            <w:tcW w:type="dxa" w:w="2160"/>
-            <w:shd w:fill="E8F4FD"/>
-          </w:tcPr>
-          <w:p>
-            <w:r>
-              <w:rPr>
-                <w:sz w:val="20"/>
-              </w:rPr>
-              <w:t>NFR-SEC-002</w:t>
-            </w:r>
-          </w:p>
-        </w:tc>
-        <w:tc>
-          <w:tcPr>
-            <w:tcW w:type="dxa" w:w="7200"/>
-            <w:shd w:fill="E8F4FD"/>
-          </w:tcPr>
-          <w:p>
-            <w:r>
-              <w:rPr>
-                <w:sz w:val="20"/>
-              </w:rPr>
-              <w:t>JWT access tokens expire in 15 minutes</w:t>
-            </w:r>
-          </w:p>
-        </w:tc>
-      </w:tr>
-      <w:tr>
-        <w:tc>
-          <w:tcPr>
-            <w:tcW w:type="dxa" w:w="2160"/>
-          </w:tcPr>
-          <w:p>
-            <w:r>
-              <w:rPr>
-                <w:sz w:val="20"/>
-              </w:rPr>
-              <w:t>NFR-SEC-003</w:t>
-            </w:r>
-          </w:p>
-        </w:tc>
-        <w:tc>
-          <w:tcPr>
-            <w:tcW w:type="dxa" w:w="7200"/>
-          </w:tcPr>
-          <w:p>
-            <w:r>
-              <w:rPr>
-                <w:sz w:val="20"/>
-              </w:rPr>
-              <w:t>Refresh tokens expire in 7 days, stored in Redis</w:t>
-            </w:r>
-          </w:p>
-        </w:tc>
-      </w:tr>
-      <w:tr>
-        <w:tc>
-          <w:tcPr>
-            <w:tcW w:type="dxa" w:w="2160"/>
-            <w:shd w:fill="E8F4FD"/>
-          </w:tcPr>
-          <w:p>
-            <w:r>
-              <w:rPr>
-                <w:sz w:val="20"/>
-              </w:rPr>
-              <w:t>NFR-SEC-004</w:t>
-            </w:r>
-          </w:p>
-        </w:tc>
-        <w:tc>
-          <w:tcPr>
-            <w:tcW w:type="dxa" w:w="7200"/>
-            <w:shd w:fill="E8F4FD"/>
-          </w:tcPr>
-          <w:p>
-            <w:r>
-              <w:rPr>
-                <w:sz w:val="20"/>
-              </w:rPr>
-              <w:t>Rate limiting: 100 requests/minute per user</w:t>
-            </w:r>
-          </w:p>
-        </w:tc>
-      </w:tr>
-      <w:tr>
-        <w:tc>
-          <w:tcPr>
-            <w:tcW w:type="dxa" w:w="2160"/>
-          </w:tcPr>
-          <w:p>
-            <w:r>
-              <w:rPr>
-                <w:sz w:val="20"/>
-              </w:rPr>
-              <w:t>NFR-SEC-005</w:t>
-            </w:r>
-          </w:p>
-        </w:tc>
-        <w:tc>
-          <w:tcPr>
-            <w:tcW w:type="dxa" w:w="7200"/>
-          </w:tcPr>
-          <w:p>
-            <w:r>
-              <w:rPr>
-                <w:sz w:val="20"/>
-              </w:rPr>
-              <w:t>All inputs validated with Zod schemas</w:t>
-            </w:r>
-          </w:p>
-        </w:tc>
-      </w:tr>
-      <w:tr>
-        <w:tc>
-          <w:tcPr>
-            <w:tcW w:type="dxa" w:w="2160"/>
-            <w:shd w:fill="E8F4FD"/>
-          </w:tcPr>
-          <w:p>
-            <w:r>
-              <w:rPr>
-                <w:sz w:val="20"/>
-              </w:rPr>
-              <w:t>NFR-SEC-006</w:t>
-            </w:r>
-          </w:p>
-        </w:tc>
-        <w:tc>
-          <w:tcPr>
-            <w:tcW w:type="dxa" w:w="7200"/>
-            <w:shd w:fill="E8F4FD"/>
-          </w:tcPr>
-          <w:p>
-            <w:r>
-              <w:rPr>
-                <w:sz w:val="20"/>
-              </w:rPr>
-              <w:t>SQL injection prevention via parameterized queries</w:t>
-            </w:r>
-          </w:p>
-        </w:tc>
-      </w:tr>
-      <w:tr>
-        <w:tc>
-          <w:tcPr>
-            <w:tcW w:type="dxa" w:w="2160"/>
-          </w:tcPr>
-          <w:p>
-            <w:r>
-              <w:rPr>
-                <w:sz w:val="20"/>
-              </w:rPr>
-              <w:t>NFR-SEC-007</w:t>
-            </w:r>
-          </w:p>
-        </w:tc>
-        <w:tc>
-          <w:tcPr>
-            <w:tcW w:type="dxa" w:w="7200"/>
-          </w:tcPr>
-          <w:p>
-            <w:r>
-              <w:rPr>
-                <w:sz w:val="20"/>
-              </w:rPr>
-              <w:t>CORS configured for allowed origins only</w:t>
-            </w:r>
-          </w:p>
-        </w:tc>
-      </w:tr>
-      <w:tr>
-        <w:tc>
-          <w:tcPr>
-            <w:tcW w:type="dxa" w:w="2160"/>
-            <w:shd w:fill="E8F4FD"/>
-          </w:tcPr>
-          <w:p>
-            <w:r>
-              <w:rPr>
-                <w:sz w:val="20"/>
-              </w:rPr>
-              <w:t>NFR-SEC-008</w:t>
-            </w:r>
-          </w:p>
-        </w:tc>
-        <w:tc>
-          <w:tcPr>
-            <w:tcW w:type="dxa" w:w="7200"/>
-            <w:shd w:fill="E8F4FD"/>
-          </w:tcPr>
-          <w:p>
-            <w:r>
-              <w:rPr>
-                <w:sz w:val="20"/>
-              </w:rPr>
-              <w:t>Helmet.js security headers</w:t>
-            </w:r>
-          </w:p>
-        </w:tc>
-      </w:tr>
-    </w:tbl>
-    <w:p>
-      <w:pPr>
-        <w:pStyle w:val="Heading2"/>
-      </w:pPr>
-      <w:r>
-        <w:rPr>
-          <w:color w:val="002B5C"/>
-        </w:rPr>
-        <w:t>6.3 Reliability &amp; Scalability</w:t>
-      </w:r>
-    </w:p>
-    <w:p>
-      <w:r>
-        <w:t>The backend must be available and handle growth.</w:t>
-      </w:r>
-    </w:p>
-    <w:tbl>
-      <w:tblPr>
-        <w:tblStyle w:val="TableGrid"/>
-        <w:tblW w:type="auto" w:w="0"/>
-        <w:jc w:val="center"/>
-        <w:tblLook w:firstColumn="1" w:firstRow="1" w:lastColumn="0" w:lastRow="0" w:noHBand="0" w:noVBand="1" w:val="04A0"/>
-      </w:tblPr>
-      <w:tblGrid>
-        <w:gridCol w:w="4703"/>
-        <w:gridCol w:w="4703"/>
-      </w:tblGrid>
-      <w:tr>
-        <w:tc>
-          <w:tcPr>
-            <w:tcW w:type="dxa" w:w="2160"/>
-            <w:shd w:fill="0070C0"/>
-          </w:tcPr>
-          <w:p>
-            <w:pPr>
-              <w:jc w:val="center"/>
-            </w:pPr>
-            <w:r>
-              <w:rPr>
-                <w:b/>
-                <w:color w:val="FFFFFF"/>
-                <w:sz w:val="20"/>
-              </w:rPr>
-              <w:t>ID</w:t>
-            </w:r>
-          </w:p>
-        </w:tc>
-        <w:tc>
-          <w:tcPr>
-            <w:tcW w:type="dxa" w:w="7200"/>
-            <w:shd w:fill="0070C0"/>
-          </w:tcPr>
-          <w:p>
-            <w:pPr>
-              <w:jc w:val="center"/>
-            </w:pPr>
-            <w:r>
-              <w:rPr>
-                <w:b/>
-                <w:color w:val="FFFFFF"/>
-                <w:sz w:val="20"/>
-              </w:rPr>
-              <w:t>Requirement</w:t>
-            </w:r>
-          </w:p>
-        </w:tc>
-      </w:tr>
-      <w:tr>
-        <w:tc>
-          <w:tcPr>
-            <w:tcW w:type="dxa" w:w="2160"/>
-          </w:tcPr>
-          <w:p>
-            <w:r>
-              <w:rPr>
-                <w:sz w:val="20"/>
-              </w:rPr>
-              <w:t>NFR-REL-001</w:t>
-            </w:r>
-          </w:p>
-        </w:tc>
-        <w:tc>
-          <w:tcPr>
-            <w:tcW w:type="dxa" w:w="7200"/>
-          </w:tcPr>
-          <w:p>
-            <w:r>
-              <w:rPr>
-                <w:sz w:val="20"/>
-              </w:rPr>
-              <w:t>99.9% uptime SLA</w:t>
-            </w:r>
-          </w:p>
-        </w:tc>
-      </w:tr>
-      <w:tr>
-        <w:tc>
-          <w:tcPr>
-            <w:tcW w:type="dxa" w:w="2160"/>
-            <w:shd w:fill="E8F4FD"/>
-          </w:tcPr>
-          <w:p>
-            <w:r>
-              <w:rPr>
-                <w:sz w:val="20"/>
-              </w:rPr>
-              <w:t>NFR-REL-002</w:t>
-            </w:r>
-          </w:p>
-        </w:tc>
-        <w:tc>
-          <w:tcPr>
-            <w:tcW w:type="dxa" w:w="7200"/>
-            <w:shd w:fill="E8F4FD"/>
-          </w:tcPr>
-          <w:p>
-            <w:r>
-              <w:rPr>
-                <w:sz w:val="20"/>
-              </w:rPr>
-              <w:t>Graceful shutdown handling (SIGTERM)</w:t>
-            </w:r>
-          </w:p>
-        </w:tc>
-      </w:tr>
-      <w:tr>
-        <w:tc>
-          <w:tcPr>
-            <w:tcW w:type="dxa" w:w="2160"/>
-          </w:tcPr>
-          <w:p>
-            <w:r>
-              <w:rPr>
-                <w:sz w:val="20"/>
-              </w:rPr>
-              <w:t>NFR-REL-003</w:t>
-            </w:r>
-          </w:p>
-        </w:tc>
-        <w:tc>
-          <w:tcPr>
-            <w:tcW w:type="dxa" w:w="7200"/>
-          </w:tcPr>
-          <w:p>
-            <w:r>
-              <w:rPr>
-                <w:sz w:val="20"/>
-              </w:rPr>
-              <w:t>Automatic database connection retry with backoff</w:t>
-            </w:r>
-          </w:p>
-        </w:tc>
-      </w:tr>
-      <w:tr>
-        <w:tc>
-          <w:tcPr>
-            <w:tcW w:type="dxa" w:w="2160"/>
-            <w:shd w:fill="E8F4FD"/>
-          </w:tcPr>
-          <w:p>
-            <w:r>
-              <w:rPr>
-                <w:sz w:val="20"/>
-              </w:rPr>
-              <w:t>NFR-REL-004</w:t>
-            </w:r>
-          </w:p>
-        </w:tc>
-        <w:tc>
-          <w:tcPr>
-            <w:tcW w:type="dxa" w:w="7200"/>
-            <w:shd w:fill="E8F4FD"/>
-          </w:tcPr>
-          <w:p>
-            <w:r>
-              <w:rPr>
-                <w:sz w:val="20"/>
-              </w:rPr>
-              <w:t>Health check endpoint (/api/health)</w:t>
-            </w:r>
-          </w:p>
-        </w:tc>
-      </w:tr>
-      <w:tr>
-        <w:tc>
-          <w:tcPr>
-            <w:tcW w:type="dxa" w:w="2160"/>
-          </w:tcPr>
-          <w:p>
-            <w:r>
-              <w:rPr>
-                <w:sz w:val="20"/>
-              </w:rPr>
-              <w:t>NFR-SCA-001</w:t>
-            </w:r>
-          </w:p>
-        </w:tc>
-        <w:tc>
-          <w:tcPr>
-            <w:tcW w:type="dxa" w:w="7200"/>
-          </w:tcPr>
-          <w:p>
-            <w:r>
-              <w:rPr>
-                <w:sz w:val="20"/>
-              </w:rPr>
-              <w:t>Horizontal scaling via stateless design</w:t>
-            </w:r>
-          </w:p>
-        </w:tc>
-      </w:tr>
-      <w:tr>
-        <w:tc>
-          <w:tcPr>
-            <w:tcW w:type="dxa" w:w="2160"/>
-            <w:shd w:fill="E8F4FD"/>
-          </w:tcPr>
-          <w:p>
-            <w:r>
-              <w:rPr>
-                <w:sz w:val="20"/>
-              </w:rPr>
-              <w:t>NFR-SCA-002</w:t>
-            </w:r>
-          </w:p>
-        </w:tc>
-        <w:tc>
-          <w:tcPr>
-            <w:tcW w:type="dxa" w:w="7200"/>
-            <w:shd w:fill="E8F4FD"/>
-          </w:tcPr>
-          <w:p>
-            <w:r>
-              <w:rPr>
-                <w:sz w:val="20"/>
-              </w:rPr>
-              <w:t>Database connection pooling (PgBouncer)</w:t>
-            </w:r>
-          </w:p>
-        </w:tc>
-      </w:tr>
-      <w:tr>
-        <w:tc>
-          <w:tcPr>
-            <w:tcW w:type="dxa" w:w="2160"/>
-          </w:tcPr>
-          <w:p>
-            <w:r>
-              <w:rPr>
-                <w:sz w:val="20"/>
-              </w:rPr>
-              <w:t>NFR-SCA-003</w:t>
-            </w:r>
-          </w:p>
-        </w:tc>
-        <w:tc>
-          <w:tcPr>
-            <w:tcW w:type="dxa" w:w="7200"/>
-          </w:tcPr>
-          <w:p>
-            <w:r>
-              <w:rPr>
-                <w:sz w:val="20"/>
-              </w:rPr>
-              <w:t>Background job processing for heavy tasks</w:t>
-            </w:r>
-          </w:p>
-        </w:tc>
-      </w:tr>
-    </w:tbl>
-    <w:p>
-      <w:pPr>
-        <w:pStyle w:val="Heading1"/>
-      </w:pPr>
-      <w:r>
-        <w:rPr>
-          <w:color w:val="002B5C"/>
-        </w:rPr>
-        <w:t>7. Background Jobs</w:t>
-      </w:r>
-    </w:p>
-    <w:p>
-      <w:r>
-        <w:t>Some tasks are too slow or complex to run during an API request. These are handled by background jobs that run asynchronously. For example, generating a PDF or sending an email shouldn't make the user wait — so it's queued as a background job.</w:t>
+        <w:t>6. Background Jobs</w:t>
       </w:r>
     </w:p>
     <w:tbl>
@@ -5663,7 +4927,7 @@
               <w:rPr>
                 <w:sz w:val="20"/>
               </w:rPr>
-              <w:t>Sends emails (welcome, password reset, quote sent, order confirmation)</w:t>
+              <w:t>Sends transactional emails</w:t>
             </w:r>
           </w:p>
         </w:tc>
@@ -5707,7 +4971,7 @@
               <w:rPr>
                 <w:sz w:val="20"/>
               </w:rPr>
-              <w:t>Creates PDF files for invoices, quotes, orders, commission statements</w:t>
+              <w:t>Creates PDF files for documents</w:t>
             </w:r>
           </w:p>
         </w:tc>
@@ -5748,7 +5012,7 @@
               <w:rPr>
                 <w:sz w:val="20"/>
               </w:rPr>
-              <w:t>Checks all products and sends alerts when stock is below reorder point</w:t>
+              <w:t>Checks stock and sends alerts</w:t>
             </w:r>
           </w:p>
         </w:tc>
@@ -5792,7 +5056,7 @@
               <w:rPr>
                 <w:sz w:val="20"/>
               </w:rPr>
-              <w:t>Notifies about invoices that are past their due date</w:t>
+              <w:t>Notifies about overdue invoices</w:t>
             </w:r>
           </w:p>
         </w:tc>
@@ -5833,7 +5097,7 @@
               <w:rPr>
                 <w:sz w:val="20"/>
               </w:rPr>
-              <w:t>Automatically marks quotes as expired when past validity date</w:t>
+              <w:t>Auto-expires past-due quotes</w:t>
             </w:r>
           </w:p>
         </w:tc>
@@ -5877,7 +5141,7 @@
               <w:rPr>
                 <w:sz w:val="20"/>
               </w:rPr>
-              <w:t>Calculates commissions for the sales rep when a deal is won</w:t>
+              <w:t>Calculates commissions</w:t>
             </w:r>
           </w:p>
         </w:tc>
@@ -5918,7 +5182,7 @@
               <w:rPr>
                 <w:sz w:val="20"/>
               </w:rPr>
-              <w:t>Updates actual amounts on sales targets from closed deals</w:t>
+              <w:t>Updates target actuals</w:t>
             </w:r>
           </w:p>
         </w:tc>
@@ -5962,7 +5226,7 @@
               <w:rPr>
                 <w:sz w:val="20"/>
               </w:rPr>
-              <w:t>Pre-generates and caches reports for faster access</w:t>
+              <w:t>Pre-generates cached reports</w:t>
             </w:r>
           </w:p>
         </w:tc>
@@ -6003,7 +5267,7 @@
               <w:rPr>
                 <w:sz w:val="20"/>
               </w:rPr>
-              <w:t>Exports large datasets to CSV/Excel files</w:t>
+              <w:t>Exports large datasets</w:t>
             </w:r>
           </w:p>
         </w:tc>
@@ -6047,7 +5311,7 @@
               <w:rPr>
                 <w:sz w:val="20"/>
               </w:rPr>
-              <w:t>Removes expired refresh tokens from Redis</w:t>
+              <w:t>Removes expired tokens</w:t>
             </w:r>
           </w:p>
         </w:tc>
@@ -6061,12 +5325,7 @@
         <w:rPr>
           <w:color w:val="002B5C"/>
         </w:rPr>
-        <w:t>8. Caching Strategy</w:t>
-      </w:r>
-    </w:p>
-    <w:p>
-      <w:r>
-        <w:t>Caching stores frequently accessed data in Redis (a fast in-memory database) to avoid hitting the main database every time. This dramatically improves performance.</w:t>
+        <w:t>7. Caching Strategy</w:t>
       </w:r>
     </w:p>
     <w:tbl>
@@ -6150,7 +5409,7 @@
               <w:rPr>
                 <w:sz w:val="20"/>
               </w:rPr>
-              <w:t>User profile data</w:t>
+              <w:t>User profiles</w:t>
             </w:r>
           </w:p>
         </w:tc>
@@ -6163,7 +5422,7 @@
               <w:rPr>
                 <w:sz w:val="20"/>
               </w:rPr>
-              <w:t>15 minutes</w:t>
+              <w:t>15 min</w:t>
             </w:r>
           </w:p>
         </w:tc>
@@ -6176,7 +5435,7 @@
               <w:rPr>
                 <w:sz w:val="20"/>
               </w:rPr>
-              <w:t>When user updates their profile</w:t>
+              <w:t>On profile update</w:t>
             </w:r>
           </w:p>
         </w:tc>
@@ -6206,7 +5465,7 @@
               <w:rPr>
                 <w:sz w:val="20"/>
               </w:rPr>
-              <w:t>30 minutes</w:t>
+              <w:t>30 min</w:t>
             </w:r>
           </w:p>
         </w:tc>
@@ -6220,7 +5479,7 @@
               <w:rPr>
                 <w:sz w:val="20"/>
               </w:rPr>
-              <w:t>When company info changes</w:t>
+              <w:t>On settings change</w:t>
             </w:r>
           </w:p>
         </w:tc>
@@ -6248,7 +5507,7 @@
               <w:rPr>
                 <w:sz w:val="20"/>
               </w:rPr>
-              <w:t>5 minutes</w:t>
+              <w:t>5 min</w:t>
             </w:r>
           </w:p>
         </w:tc>
@@ -6261,7 +5520,7 @@
               <w:rPr>
                 <w:sz w:val="20"/>
               </w:rPr>
-              <w:t>When any relevant data changes</w:t>
+              <w:t>On data mutation</w:t>
             </w:r>
           </w:p>
         </w:tc>
@@ -6291,7 +5550,7 @@
               <w:rPr>
                 <w:sz w:val="20"/>
               </w:rPr>
-              <w:t>5 minutes</w:t>
+              <w:t>5 min</w:t>
             </w:r>
           </w:p>
         </w:tc>
@@ -6305,7 +5564,7 @@
               <w:rPr>
                 <w:sz w:val="20"/>
               </w:rPr>
-              <w:t>When a deal changes stage</w:t>
+              <w:t>On deal change</w:t>
             </w:r>
           </w:p>
         </w:tc>
@@ -6333,7 +5592,7 @@
               <w:rPr>
                 <w:sz w:val="20"/>
               </w:rPr>
-              <w:t>10 minutes</w:t>
+              <w:t>10 min</w:t>
             </w:r>
           </w:p>
         </w:tc>
@@ -6346,7 +5605,7 @@
               <w:rPr>
                 <w:sz w:val="20"/>
               </w:rPr>
-              <w:t>When products are added/updated</w:t>
+              <w:t>On product CRUD</w:t>
             </w:r>
           </w:p>
         </w:tc>
@@ -6376,7 +5635,7 @@
               <w:rPr>
                 <w:sz w:val="20"/>
               </w:rPr>
-              <w:t>5 minutes</w:t>
+              <w:t>5 min</w:t>
             </w:r>
           </w:p>
         </w:tc>
@@ -6390,7 +5649,7 @@
               <w:rPr>
                 <w:sz w:val="20"/>
               </w:rPr>
-              <w:t>When a deal closes</w:t>
+              <w:t>On deal close</w:t>
             </w:r>
           </w:p>
         </w:tc>
@@ -6405,7 +5664,7 @@
               <w:rPr>
                 <w:sz w:val="20"/>
               </w:rPr>
-              <w:t>Commission data</w:t>
+              <w:t>Commissions</w:t>
             </w:r>
           </w:p>
         </w:tc>
@@ -6418,7 +5677,7 @@
               <w:rPr>
                 <w:sz w:val="20"/>
               </w:rPr>
-              <w:t>5 minutes</w:t>
+              <w:t>5 min</w:t>
             </w:r>
           </w:p>
         </w:tc>
@@ -6431,7 +5690,7 @@
               <w:rPr>
                 <w:sz w:val="20"/>
               </w:rPr>
-              <w:t>When commissions are processed</w:t>
+              <w:t>On commission change</w:t>
             </w:r>
           </w:p>
         </w:tc>
@@ -6447,7 +5706,7 @@
               <w:rPr>
                 <w:sz w:val="20"/>
               </w:rPr>
-              <w:t>Report data</w:t>
+              <w:t>Reports</w:t>
             </w:r>
           </w:p>
         </w:tc>
@@ -6461,7 +5720,7 @@
               <w:rPr>
                 <w:sz w:val="20"/>
               </w:rPr>
-              <w:t>15 minutes</w:t>
+              <w:t>15 min</w:t>
             </w:r>
           </w:p>
         </w:tc>
@@ -6475,7 +5734,7 @@
               <w:rPr>
                 <w:sz w:val="20"/>
               </w:rPr>
-              <w:t>When underlying data changes</w:t>
+              <w:t>On data change</w:t>
             </w:r>
           </w:p>
         </w:tc>
@@ -6490,7 +5749,7 @@
               <w:rPr>
                 <w:sz w:val="20"/>
               </w:rPr>
-              <w:t>User sessions</w:t>
+              <w:t>Sessions</w:t>
             </w:r>
           </w:p>
         </w:tc>
@@ -6516,7 +5775,7 @@
               <w:rPr>
                 <w:sz w:val="20"/>
               </w:rPr>
-              <w:t>When user logs out</w:t>
+              <w:t>On logout</w:t>
             </w:r>
           </w:p>
         </w:tc>
@@ -6530,48 +5789,7 @@
         <w:rPr>
           <w:color w:val="002B5C"/>
         </w:rPr>
-        <w:t>9. Error Handling</w:t>
-      </w:r>
-    </w:p>
-    <w:p>
-      <w:r>
-        <w:t>All API errors return a consistent JSON format so the frontend can handle them uniformly.</w:t>
-      </w:r>
-    </w:p>
-    <w:p>
-      <w:r>
-        <w:rPr>
-          <w:rFonts w:ascii="Courier New" w:hAnsi="Courier New"/>
-          <w:sz w:val="18"/>
-        </w:rPr>
-        <w:t>{</w:t>
-        <w:br/>
-        <w:t xml:space="preserve">  "success": false,</w:t>
-        <w:br/>
-        <w:t xml:space="preserve">  "error": {</w:t>
-        <w:br/>
-        <w:t xml:space="preserve">    "code": "VALIDATION_ERROR",</w:t>
-        <w:br/>
-        <w:t xml:space="preserve">    "message": "Invalid input data",</w:t>
-        <w:br/>
-        <w:t xml:space="preserve">    "details": [{"field": "email", "message": "Must be valid"}]</w:t>
-        <w:br/>
-        <w:t xml:space="preserve">  },</w:t>
-        <w:br/>
-        <w:t xml:space="preserve">  "requestId": "uuid-v4"</w:t>
-        <w:br/>
-        <w:t>}</w:t>
-      </w:r>
-    </w:p>
-    <w:p>
-      <w:pPr>
-        <w:pStyle w:val="Heading2"/>
-      </w:pPr>
-      <w:r>
-        <w:rPr>
-          <w:color w:val="002B5C"/>
-        </w:rPr>
-        <w:t>Error Codes</w:t>
+        <w:t>8. Error Handling</w:t>
       </w:r>
     </w:p>
     <w:tbl>
@@ -6681,7 +5899,7 @@
               <w:rPr>
                 <w:sz w:val="20"/>
               </w:rPr>
-              <w:t>User submitted invalid data (missing fields, wrong format)</w:t>
+              <w:t>Invalid input data</w:t>
             </w:r>
           </w:p>
         </w:tc>
@@ -6725,7 +5943,7 @@
               <w:rPr>
                 <w:sz w:val="20"/>
               </w:rPr>
-              <w:t>User is not logged in or token expired</w:t>
+              <w:t>Not logged in or token expired</w:t>
             </w:r>
           </w:p>
         </w:tc>
@@ -6766,7 +5984,7 @@
               <w:rPr>
                 <w:sz w:val="20"/>
               </w:rPr>
-              <w:t>User is logged in but doesn't have permission</w:t>
+              <w:t>No permission for this action</w:t>
             </w:r>
           </w:p>
         </w:tc>
@@ -6810,7 +6028,7 @@
               <w:rPr>
                 <w:sz w:val="20"/>
               </w:rPr>
-              <w:t>Requested resource doesn't exist</w:t>
+              <w:t>Resource doesn't exist</w:t>
             </w:r>
           </w:p>
         </w:tc>
@@ -6851,7 +6069,7 @@
               <w:rPr>
                 <w:sz w:val="20"/>
               </w:rPr>
-              <w:t>Resource already exists (duplicate email, SKU, etc.)</w:t>
+              <w:t>Resource already exists</w:t>
             </w:r>
           </w:p>
         </w:tc>
@@ -6895,7 +6113,7 @@
               <w:rPr>
                 <w:sz w:val="20"/>
               </w:rPr>
-              <w:t>Trying to accept a quote that has expired</w:t>
+              <w:t>Quote has expired</w:t>
             </w:r>
           </w:p>
         </w:tc>
@@ -6936,7 +6154,7 @@
               <w:rPr>
                 <w:sz w:val="20"/>
               </w:rPr>
-              <w:t>Not enough stock to fulfill an order</w:t>
+              <w:t>Not enough stock</w:t>
             </w:r>
           </w:p>
         </w:tc>
@@ -6980,7 +6198,7 @@
               <w:rPr>
                 <w:sz w:val="20"/>
               </w:rPr>
-              <w:t>Too many requests — user needs to slow down</w:t>
+              <w:t>Too many requests</w:t>
             </w:r>
           </w:p>
         </w:tc>
@@ -7035,23 +6253,7 @@
         <w:rPr>
           <w:color w:val="002B5C"/>
         </w:rPr>
-        <w:t>10. Testing Requirements</w:t>
-      </w:r>
-    </w:p>
-    <w:p>
-      <w:r>
-        <w:t>Every feature must be tested before deployment to ensure reliability.</w:t>
-      </w:r>
-    </w:p>
-    <w:p>
-      <w:pPr>
-        <w:pStyle w:val="Heading2"/>
-      </w:pPr>
-      <w:r>
-        <w:rPr>
-          <w:color w:val="002B5C"/>
-        </w:rPr>
-        <w:t>10.1 What We Test</w:t>
+        <w:t>9. Testing Requirements</w:t>
       </w:r>
     </w:p>
     <w:tbl>
@@ -7148,7 +6350,7 @@
               <w:rPr>
                 <w:sz w:val="20"/>
               </w:rPr>
-              <w:t>Individual functions, calculations, validators</w:t>
+              <w:t>Individual functions, calculations</w:t>
             </w:r>
           </w:p>
         </w:tc>
@@ -7191,7 +6393,7 @@
               <w:rPr>
                 <w:sz w:val="20"/>
               </w:rPr>
-              <w:t>API endpoints, database operations, auth flows</w:t>
+              <w:t>API endpoints, database, auth</w:t>
             </w:r>
           </w:p>
         </w:tc>
@@ -7233,7 +6435,7 @@
               <w:rPr>
                 <w:sz w:val="20"/>
               </w:rPr>
-              <w:t>Complete user workflows (lead → quote → order)</w:t>
+              <w:t>Complete user workflows</w:t>
             </w:r>
           </w:p>
         </w:tc>
@@ -7276,7 +6478,7 @@
               <w:rPr>
                 <w:sz w:val="20"/>
               </w:rPr>
-              <w:t>Load testing, response time benchmarks</w:t>
+              <w:t>Load testing, benchmarks</w:t>
             </w:r>
           </w:p>
         </w:tc>
@@ -7296,22 +6498,6 @@
         </w:tc>
       </w:tr>
     </w:tbl>
-    <w:p>
-      <w:pPr>
-        <w:pStyle w:val="Heading2"/>
-      </w:pPr>
-      <w:r>
-        <w:rPr>
-          <w:color w:val="002B5C"/>
-        </w:rPr>
-        <w:t>10.2 Coverage Target</w:t>
-      </w:r>
-    </w:p>
-    <w:p>
-      <w:r>
-        <w:t>Minimum 80% code coverage. All critical paths (sales flow, stock changes, commission calculations) must have 100% test coverage.</w:t>
-      </w:r>
-    </w:p>
     <w:sectPr>
       <w:headerReference w:type="default" r:id="rId9"/>
       <w:footerReference w:type="default" r:id="rId10"/>
@@ -7354,7 +6540,7 @@
         <w:color w:val="0070C0"/>
         <w:sz w:val="18"/>
       </w:rPr>
-      <w:t>OneGemmy — Backend SRS v1.2</w:t>
+      <w:t>OneGemmy — Backend SRS v1.3</w:t>
     </w:r>
   </w:p>
 </w:hdr>

</xml_diff>